<commit_message>
Module 11.2 assignment push
</commit_message>
<xml_diff>
--- a/module-10/Bronson_Assignment_10_2.docx
+++ b/module-10/Bronson_Assignment_10_2.docx
@@ -79,6 +79,56 @@
             </a:graphic>
           </wp:inline>
         </w:drawing>
+      </w:r>
+    </w:p>
+    <w:p>
+      <w:pPr>
+        <w:jc w:val="center"/>
+      </w:pPr>
+      <w:r>
+        <w:drawing>
+          <wp:inline distT="0" distB="0" distL="0" distR="0" wp14:anchorId="1A026222" wp14:editId="7B8C1BBB">
+            <wp:extent cx="5943600" cy="1965325"/>
+            <wp:effectExtent l="0" t="0" r="0" b="0"/>
+            <wp:docPr id="1908744055" name="Picture 1"/>
+            <wp:cNvGraphicFramePr>
+              <a:graphicFrameLocks xmlns:a="http://schemas.openxmlformats.org/drawingml/2006/main" noChangeAspect="1"/>
+            </wp:cNvGraphicFramePr>
+            <a:graphic xmlns:a="http://schemas.openxmlformats.org/drawingml/2006/main">
+              <a:graphicData uri="http://schemas.openxmlformats.org/drawingml/2006/picture">
+                <pic:pic xmlns:pic="http://schemas.openxmlformats.org/drawingml/2006/picture">
+                  <pic:nvPicPr>
+                    <pic:cNvPr id="1908744055" name=""/>
+                    <pic:cNvPicPr/>
+                  </pic:nvPicPr>
+                  <pic:blipFill>
+                    <a:blip r:embed="rId5"/>
+                    <a:stretch>
+                      <a:fillRect/>
+                    </a:stretch>
+                  </pic:blipFill>
+                  <pic:spPr>
+                    <a:xfrm>
+                      <a:off x="0" y="0"/>
+                      <a:ext cx="5943600" cy="1965325"/>
+                    </a:xfrm>
+                    <a:prstGeom prst="rect">
+                      <a:avLst/>
+                    </a:prstGeom>
+                  </pic:spPr>
+                </pic:pic>
+              </a:graphicData>
+            </a:graphic>
+          </wp:inline>
+        </w:drawing>
+      </w:r>
+    </w:p>
+    <w:p>
+      <w:r>
+        <w:t xml:space="preserve">URL: </w:t>
+      </w:r>
+      <w:r>
+        <w:t>https://github.com/Wendybronson/csd-402.git</w:t>
       </w:r>
     </w:p>
     <w:sectPr>

</xml_diff>